<commit_message>
Your update message here
</commit_message>
<xml_diff>
--- a/React App.docx
+++ b/React App.docx
@@ -4722,6 +4722,7 @@
         <w:keepLines w:val="0"/>
         <w:widowControl/>
         <w:numPr>
+          <w:ilvl w:val="0"/>
           <w:numId w:val="0"/>
         </w:numPr>
         <w:suppressLineNumbers w:val="0"/>
@@ -5793,13 +5794,128 @@
           <w:szCs w:val="32"/>
         </w:rPr>
       </w:pPr>
-      <w:r>
+    </w:p>
+    <w:p>
+      <w:pPr>
+        <w:pStyle w:val="3"/>
+        <w:keepNext w:val="0"/>
+        <w:keepLines w:val="0"/>
+        <w:widowControl/>
+        <w:suppressLineNumbers w:val="0"/>
         <w:rPr>
           <w:rFonts w:hint="default" w:ascii="Arial" w:hAnsi="Arial" w:cs="Arial"/>
           <w:sz w:val="32"/>
           <w:szCs w:val="32"/>
         </w:rPr>
-        <w:t>6. Install Docker on EC2</w:t>
+      </w:pPr>
+    </w:p>
+    <w:p>
+      <w:pPr>
+        <w:pStyle w:val="3"/>
+        <w:keepNext w:val="0"/>
+        <w:keepLines w:val="0"/>
+        <w:widowControl/>
+        <w:suppressLineNumbers w:val="0"/>
+        <w:rPr>
+          <w:rFonts w:hint="default" w:ascii="Arial" w:hAnsi="Arial" w:cs="Arial"/>
+          <w:sz w:val="32"/>
+          <w:szCs w:val="32"/>
+        </w:rPr>
+      </w:pPr>
+    </w:p>
+    <w:p>
+      <w:pPr>
+        <w:pStyle w:val="3"/>
+        <w:keepNext w:val="0"/>
+        <w:keepLines w:val="0"/>
+        <w:widowControl/>
+        <w:suppressLineNumbers w:val="0"/>
+        <w:rPr>
+          <w:rFonts w:hint="default" w:ascii="Arial" w:hAnsi="Arial" w:cs="Arial"/>
+          <w:sz w:val="32"/>
+          <w:szCs w:val="32"/>
+        </w:rPr>
+      </w:pPr>
+    </w:p>
+    <w:p>
+      <w:pPr>
+        <w:pStyle w:val="3"/>
+        <w:keepNext w:val="0"/>
+        <w:keepLines w:val="0"/>
+        <w:widowControl/>
+        <w:suppressLineNumbers w:val="0"/>
+        <w:rPr>
+          <w:rFonts w:hint="default" w:ascii="Arial" w:hAnsi="Arial" w:cs="Arial"/>
+          <w:sz w:val="32"/>
+          <w:szCs w:val="32"/>
+        </w:rPr>
+      </w:pPr>
+    </w:p>
+    <w:p>
+      <w:pPr>
+        <w:pStyle w:val="3"/>
+        <w:keepNext w:val="0"/>
+        <w:keepLines w:val="0"/>
+        <w:widowControl/>
+        <w:suppressLineNumbers w:val="0"/>
+        <w:rPr>
+          <w:rFonts w:hint="default" w:ascii="Arial" w:hAnsi="Arial" w:cs="Arial"/>
+          <w:sz w:val="32"/>
+          <w:szCs w:val="32"/>
+        </w:rPr>
+      </w:pPr>
+    </w:p>
+    <w:p>
+      <w:pPr>
+        <w:pStyle w:val="3"/>
+        <w:keepNext w:val="0"/>
+        <w:keepLines w:val="0"/>
+        <w:widowControl/>
+        <w:suppressLineNumbers w:val="0"/>
+        <w:rPr>
+          <w:rFonts w:hint="default" w:ascii="Arial" w:hAnsi="Arial" w:cs="Arial"/>
+          <w:sz w:val="32"/>
+          <w:szCs w:val="32"/>
+        </w:rPr>
+      </w:pPr>
+    </w:p>
+    <w:p>
+      <w:pPr>
+        <w:pStyle w:val="3"/>
+        <w:keepNext w:val="0"/>
+        <w:keepLines w:val="0"/>
+        <w:widowControl/>
+        <w:suppressLineNumbers w:val="0"/>
+        <w:rPr>
+          <w:rFonts w:hint="default" w:ascii="Arial" w:hAnsi="Arial" w:cs="Arial"/>
+          <w:sz w:val="32"/>
+          <w:szCs w:val="32"/>
+        </w:rPr>
+      </w:pPr>
+      <w:r>
+        <w:rPr>
+          <w:rFonts w:hint="default" w:ascii="Arial" w:hAnsi="Arial" w:cs="Arial"/>
+          <w:sz w:val="32"/>
+          <w:szCs w:val="32"/>
+        </w:rPr>
+        <w:t xml:space="preserve">6. Install Docker </w:t>
+      </w:r>
+      <w:r>
+        <w:rPr>
+          <w:rFonts w:hint="default" w:ascii="Arial" w:hAnsi="Arial" w:cs="Arial"/>
+          <w:sz w:val="32"/>
+          <w:szCs w:val="32"/>
+          <w:lang w:val="en-IN"/>
+        </w:rPr>
+        <w:t xml:space="preserve">&amp; Docker compose </w:t>
+      </w:r>
+      <w:r>
+        <w:rPr>
+          <w:rFonts w:hint="default" w:ascii="Arial" w:hAnsi="Arial" w:cs="Arial"/>
+          <w:sz w:val="32"/>
+          <w:szCs w:val="32"/>
+        </w:rPr>
+        <w:t>on EC2</w:t>
       </w:r>
     </w:p>
     <w:p>
@@ -5921,6 +6037,19 @@
         </w:rPr>
         <w:t>newgrp docker   # apply group change without re-login</w:t>
       </w:r>
+    </w:p>
+    <w:p>
+      <w:pPr>
+        <w:pStyle w:val="10"/>
+        <w:keepNext w:val="0"/>
+        <w:keepLines w:val="0"/>
+        <w:widowControl/>
+        <w:suppressLineNumbers w:val="0"/>
+        <w:rPr>
+          <w:rStyle w:val="9"/>
+          <w:rFonts w:hint="default" w:ascii="Arial" w:hAnsi="Arial" w:cs="Arial"/>
+        </w:rPr>
+      </w:pPr>
     </w:p>
     <w:p>
       <w:pPr>
@@ -6005,6 +6134,119 @@
         </w:rPr>
       </w:pPr>
       <w:r>
+        <w:drawing>
+          <wp:inline distT="0" distB="0" distL="114300" distR="114300">
+            <wp:extent cx="5274310" cy="2785745"/>
+            <wp:effectExtent l="0" t="0" r="13970" b="3175"/>
+            <wp:docPr id="15" name="Picture 3"/>
+            <wp:cNvGraphicFramePr>
+              <a:graphicFrameLocks xmlns:a="http://schemas.openxmlformats.org/drawingml/2006/main" noChangeAspect="1"/>
+            </wp:cNvGraphicFramePr>
+            <a:graphic xmlns:a="http://schemas.openxmlformats.org/drawingml/2006/main">
+              <a:graphicData uri="http://schemas.openxmlformats.org/drawingml/2006/picture">
+                <pic:pic xmlns:pic="http://schemas.openxmlformats.org/drawingml/2006/picture">
+                  <pic:nvPicPr>
+                    <pic:cNvPr id="15" name="Picture 3"/>
+                    <pic:cNvPicPr>
+                      <a:picLocks noChangeAspect="1"/>
+                    </pic:cNvPicPr>
+                  </pic:nvPicPr>
+                  <pic:blipFill>
+                    <a:blip r:embed="rId10"/>
+                    <a:stretch>
+                      <a:fillRect/>
+                    </a:stretch>
+                  </pic:blipFill>
+                  <pic:spPr>
+                    <a:xfrm>
+                      <a:off x="0" y="0"/>
+                      <a:ext cx="5274310" cy="2785745"/>
+                    </a:xfrm>
+                    <a:prstGeom prst="rect">
+                      <a:avLst/>
+                    </a:prstGeom>
+                    <a:noFill/>
+                    <a:ln>
+                      <a:noFill/>
+                    </a:ln>
+                  </pic:spPr>
+                </pic:pic>
+              </a:graphicData>
+            </a:graphic>
+          </wp:inline>
+        </w:drawing>
+      </w:r>
+    </w:p>
+    <w:p>
+      <w:pPr>
+        <w:pStyle w:val="3"/>
+        <w:keepNext w:val="0"/>
+        <w:keepLines w:val="0"/>
+        <w:widowControl/>
+        <w:suppressLineNumbers w:val="0"/>
+        <w:rPr>
+          <w:rFonts w:hint="default" w:ascii="Arial" w:hAnsi="Arial" w:cs="Arial"/>
+          <w:sz w:val="32"/>
+          <w:szCs w:val="32"/>
+        </w:rPr>
+      </w:pPr>
+    </w:p>
+    <w:p>
+      <w:pPr>
+        <w:pStyle w:val="3"/>
+        <w:keepNext w:val="0"/>
+        <w:keepLines w:val="0"/>
+        <w:widowControl/>
+        <w:suppressLineNumbers w:val="0"/>
+        <w:rPr>
+          <w:rFonts w:hint="default" w:ascii="Arial" w:hAnsi="Arial" w:cs="Arial"/>
+          <w:sz w:val="32"/>
+          <w:szCs w:val="32"/>
+        </w:rPr>
+      </w:pPr>
+    </w:p>
+    <w:p>
+      <w:pPr>
+        <w:pStyle w:val="3"/>
+        <w:keepNext w:val="0"/>
+        <w:keepLines w:val="0"/>
+        <w:widowControl/>
+        <w:suppressLineNumbers w:val="0"/>
+        <w:rPr>
+          <w:rFonts w:hint="default" w:ascii="Arial" w:hAnsi="Arial" w:cs="Arial"/>
+          <w:sz w:val="32"/>
+          <w:szCs w:val="32"/>
+        </w:rPr>
+      </w:pPr>
+    </w:p>
+    <w:p>
+      <w:pPr>
+        <w:pStyle w:val="3"/>
+        <w:keepNext w:val="0"/>
+        <w:keepLines w:val="0"/>
+        <w:widowControl/>
+        <w:suppressLineNumbers w:val="0"/>
+        <w:rPr>
+          <w:rFonts w:hint="default" w:ascii="Arial" w:hAnsi="Arial" w:cs="Arial"/>
+          <w:sz w:val="32"/>
+          <w:szCs w:val="32"/>
+        </w:rPr>
+      </w:pPr>
+    </w:p>
+    <w:p>
+      <w:pPr>
+        <w:pStyle w:val="3"/>
+        <w:keepNext w:val="0"/>
+        <w:keepLines w:val="0"/>
+        <w:widowControl/>
+        <w:suppressLineNumbers w:val="0"/>
+        <w:rPr>
+          <w:rFonts w:hint="default" w:ascii="Arial" w:hAnsi="Arial" w:cs="Arial"/>
+          <w:sz w:val="32"/>
+          <w:szCs w:val="32"/>
+        </w:rPr>
+      </w:pPr>
+      <w:r>
         <w:rPr>
           <w:rFonts w:hint="default" w:ascii="Arial" w:hAnsi="Arial" w:cs="Arial"/>
           <w:sz w:val="32"/>
@@ -6097,7 +6339,7 @@
                     </pic:cNvPicPr>
                   </pic:nvPicPr>
                   <pic:blipFill>
-                    <a:blip r:embed="rId10"/>
+                    <a:blip r:embed="rId11"/>
                     <a:stretch>
                       <a:fillRect/>
                     </a:stretch>
@@ -6643,7 +6885,7 @@
                     </pic:cNvPicPr>
                   </pic:nvPicPr>
                   <pic:blipFill>
-                    <a:blip r:embed="rId11"/>
+                    <a:blip r:embed="rId12"/>
                     <a:stretch>
                       <a:fillRect/>
                     </a:stretch>
@@ -6961,7 +7203,7 @@
                     </pic:cNvPicPr>
                   </pic:nvPicPr>
                   <pic:blipFill>
-                    <a:blip r:embed="rId12"/>
+                    <a:blip r:embed="rId13"/>
                     <a:stretch>
                       <a:fillRect/>
                     </a:stretch>
@@ -7039,7 +7281,7 @@
                     </pic:cNvPicPr>
                   </pic:nvPicPr>
                   <pic:blipFill>
-                    <a:blip r:embed="rId13"/>
+                    <a:blip r:embed="rId14"/>
                     <a:stretch>
                       <a:fillRect/>
                     </a:stretch>
@@ -7098,7 +7340,7 @@
                     </pic:cNvPicPr>
                   </pic:nvPicPr>
                   <pic:blipFill>
-                    <a:blip r:embed="rId14"/>
+                    <a:blip r:embed="rId15"/>
                     <a:stretch>
                       <a:fillRect/>
                     </a:stretch>
@@ -7160,7 +7402,7 @@
                     </pic:cNvPicPr>
                   </pic:nvPicPr>
                   <pic:blipFill>
-                    <a:blip r:embed="rId15"/>
+                    <a:blip r:embed="rId16"/>
                     <a:stretch>
                       <a:fillRect/>
                     </a:stretch>
@@ -7222,7 +7464,7 @@
                     </pic:cNvPicPr>
                   </pic:nvPicPr>
                   <pic:blipFill>
-                    <a:blip r:embed="rId16"/>
+                    <a:blip r:embed="rId17"/>
                     <a:stretch>
                       <a:fillRect/>
                     </a:stretch>
@@ -7425,6 +7667,7 @@
         <w:keepLines w:val="0"/>
         <w:widowControl/>
         <w:numPr>
+          <w:ilvl w:val="0"/>
           <w:numId w:val="0"/>
         </w:numPr>
         <w:suppressLineNumbers w:val="0"/>
@@ -7463,7 +7706,7 @@
                     </pic:cNvPicPr>
                   </pic:nvPicPr>
                   <pic:blipFill>
-                    <a:blip r:embed="rId17"/>
+                    <a:blip r:embed="rId18"/>
                     <a:stretch>
                       <a:fillRect/>
                     </a:stretch>
@@ -7501,6 +7744,76 @@
           <w:szCs w:val="32"/>
         </w:rPr>
       </w:pPr>
+    </w:p>
+    <w:p>
+      <w:pPr>
+        <w:pStyle w:val="3"/>
+        <w:keepNext w:val="0"/>
+        <w:keepLines w:val="0"/>
+        <w:widowControl/>
+        <w:suppressLineNumbers w:val="0"/>
+        <w:rPr>
+          <w:rFonts w:hint="default" w:ascii="Arial" w:hAnsi="Arial" w:cs="Arial"/>
+          <w:sz w:val="32"/>
+          <w:szCs w:val="32"/>
+        </w:rPr>
+      </w:pPr>
+    </w:p>
+    <w:p>
+      <w:pPr>
+        <w:pStyle w:val="3"/>
+        <w:keepNext w:val="0"/>
+        <w:keepLines w:val="0"/>
+        <w:widowControl/>
+        <w:suppressLineNumbers w:val="0"/>
+        <w:rPr>
+          <w:rFonts w:hint="default" w:ascii="Arial" w:hAnsi="Arial" w:cs="Arial"/>
+          <w:sz w:val="32"/>
+          <w:szCs w:val="32"/>
+        </w:rPr>
+      </w:pPr>
+    </w:p>
+    <w:p>
+      <w:pPr>
+        <w:pStyle w:val="3"/>
+        <w:keepNext w:val="0"/>
+        <w:keepLines w:val="0"/>
+        <w:widowControl/>
+        <w:suppressLineNumbers w:val="0"/>
+        <w:rPr>
+          <w:rFonts w:hint="default" w:ascii="Arial" w:hAnsi="Arial" w:cs="Arial"/>
+          <w:sz w:val="32"/>
+          <w:szCs w:val="32"/>
+        </w:rPr>
+      </w:pPr>
+    </w:p>
+    <w:p>
+      <w:pPr>
+        <w:pStyle w:val="3"/>
+        <w:keepNext w:val="0"/>
+        <w:keepLines w:val="0"/>
+        <w:widowControl/>
+        <w:suppressLineNumbers w:val="0"/>
+        <w:rPr>
+          <w:rFonts w:hint="default" w:ascii="Arial" w:hAnsi="Arial" w:cs="Arial"/>
+          <w:sz w:val="32"/>
+          <w:szCs w:val="32"/>
+        </w:rPr>
+      </w:pPr>
+    </w:p>
+    <w:p>
+      <w:pPr>
+        <w:pStyle w:val="3"/>
+        <w:keepNext w:val="0"/>
+        <w:keepLines w:val="0"/>
+        <w:widowControl/>
+        <w:suppressLineNumbers w:val="0"/>
+        <w:rPr>
+          <w:rFonts w:hint="default" w:ascii="Arial" w:hAnsi="Arial" w:cs="Arial"/>
+          <w:sz w:val="32"/>
+          <w:szCs w:val="32"/>
+        </w:rPr>
+      </w:pPr>
       <w:r>
         <w:rPr>
           <w:rFonts w:hint="default" w:ascii="Arial" w:hAnsi="Arial" w:cs="Arial"/>
@@ -7657,6 +7970,42 @@
     </w:p>
     <w:p>
       <w:pPr>
+        <w:keepNext w:val="0"/>
+        <w:keepLines w:val="0"/>
+        <w:widowControl/>
+        <w:numPr>
+          <w:numId w:val="0"/>
+        </w:numPr>
+        <w:suppressLineNumbers w:val="0"/>
+        <w:tabs>
+          <w:tab w:val="left" w:pos="720"/>
+        </w:tabs>
+        <w:spacing w:before="0" w:beforeAutospacing="1" w:after="0" w:afterAutospacing="1"/>
+        <w:rPr>
+          <w:rFonts w:hint="default" w:ascii="Arial" w:hAnsi="Arial" w:cs="Arial"/>
+        </w:rPr>
+      </w:pPr>
+    </w:p>
+    <w:p>
+      <w:pPr>
+        <w:keepNext w:val="0"/>
+        <w:keepLines w:val="0"/>
+        <w:widowControl/>
+        <w:numPr>
+          <w:numId w:val="0"/>
+        </w:numPr>
+        <w:suppressLineNumbers w:val="0"/>
+        <w:tabs>
+          <w:tab w:val="left" w:pos="720"/>
+        </w:tabs>
+        <w:spacing w:before="0" w:beforeAutospacing="1" w:after="0" w:afterAutospacing="1"/>
+        <w:rPr>
+          <w:rFonts w:hint="default" w:ascii="Arial" w:hAnsi="Arial" w:cs="Arial"/>
+        </w:rPr>
+      </w:pPr>
+    </w:p>
+    <w:p>
+      <w:pPr>
         <w:pStyle w:val="3"/>
         <w:keepNext w:val="0"/>
         <w:keepLines w:val="0"/>
@@ -7813,8 +8162,6 @@
           <w:rFonts w:hint="default" w:ascii="Arial" w:hAnsi="Arial" w:cs="Arial"/>
         </w:rPr>
       </w:pPr>
-      <w:bookmarkStart w:id="0" w:name="_GoBack"/>
-      <w:bookmarkEnd w:id="0"/>
       <w:r>
         <w:rPr>
           <w:rFonts w:hint="default" w:ascii="Arial" w:hAnsi="Arial" w:cs="Arial"/>
@@ -7990,6 +8337,265 @@
           <w:rFonts w:hint="default" w:ascii="Arial" w:hAnsi="Arial" w:cs="Arial"/>
         </w:rPr>
         <w:t xml:space="preserve"> in a browser.</w:t>
+      </w:r>
+    </w:p>
+    <w:p>
+      <w:pPr>
+        <w:keepNext w:val="0"/>
+        <w:keepLines w:val="0"/>
+        <w:widowControl/>
+        <w:numPr>
+          <w:numId w:val="0"/>
+        </w:numPr>
+        <w:suppressLineNumbers w:val="0"/>
+        <w:tabs>
+          <w:tab w:val="left" w:pos="720"/>
+        </w:tabs>
+        <w:spacing w:before="0" w:beforeAutospacing="1" w:after="0" w:afterAutospacing="1"/>
+      </w:pPr>
+      <w:r>
+        <w:drawing>
+          <wp:inline distT="0" distB="0" distL="114300" distR="114300">
+            <wp:extent cx="5273040" cy="2880360"/>
+            <wp:effectExtent l="0" t="0" r="0" b="0"/>
+            <wp:docPr id="16" name="Picture 4"/>
+            <wp:cNvGraphicFramePr>
+              <a:graphicFrameLocks xmlns:a="http://schemas.openxmlformats.org/drawingml/2006/main" noChangeAspect="1"/>
+            </wp:cNvGraphicFramePr>
+            <a:graphic xmlns:a="http://schemas.openxmlformats.org/drawingml/2006/main">
+              <a:graphicData uri="http://schemas.openxmlformats.org/drawingml/2006/picture">
+                <pic:pic xmlns:pic="http://schemas.openxmlformats.org/drawingml/2006/picture">
+                  <pic:nvPicPr>
+                    <pic:cNvPr id="16" name="Picture 4"/>
+                    <pic:cNvPicPr>
+                      <a:picLocks noChangeAspect="1"/>
+                    </pic:cNvPicPr>
+                  </pic:nvPicPr>
+                  <pic:blipFill>
+                    <a:blip r:embed="rId19"/>
+                    <a:stretch>
+                      <a:fillRect/>
+                    </a:stretch>
+                  </pic:blipFill>
+                  <pic:spPr>
+                    <a:xfrm>
+                      <a:off x="0" y="0"/>
+                      <a:ext cx="5273040" cy="2880360"/>
+                    </a:xfrm>
+                    <a:prstGeom prst="rect">
+                      <a:avLst/>
+                    </a:prstGeom>
+                    <a:noFill/>
+                    <a:ln>
+                      <a:noFill/>
+                    </a:ln>
+                  </pic:spPr>
+                </pic:pic>
+              </a:graphicData>
+            </a:graphic>
+          </wp:inline>
+        </w:drawing>
+      </w:r>
+    </w:p>
+    <w:p>
+      <w:pPr>
+        <w:keepNext w:val="0"/>
+        <w:keepLines w:val="0"/>
+        <w:widowControl/>
+        <w:numPr>
+          <w:numId w:val="0"/>
+        </w:numPr>
+        <w:suppressLineNumbers w:val="0"/>
+        <w:tabs>
+          <w:tab w:val="left" w:pos="720"/>
+        </w:tabs>
+        <w:spacing w:before="0" w:beforeAutospacing="1" w:after="0" w:afterAutospacing="1"/>
+      </w:pPr>
+    </w:p>
+    <w:p>
+      <w:pPr>
+        <w:keepNext w:val="0"/>
+        <w:keepLines w:val="0"/>
+        <w:widowControl/>
+        <w:numPr>
+          <w:numId w:val="0"/>
+        </w:numPr>
+        <w:suppressLineNumbers w:val="0"/>
+        <w:tabs>
+          <w:tab w:val="left" w:pos="720"/>
+        </w:tabs>
+        <w:spacing w:before="0" w:beforeAutospacing="1" w:after="0" w:afterAutospacing="1"/>
+      </w:pPr>
+      <w:r>
+        <w:drawing>
+          <wp:inline distT="0" distB="0" distL="114300" distR="114300">
+            <wp:extent cx="5274310" cy="2970530"/>
+            <wp:effectExtent l="0" t="0" r="13970" b="1270"/>
+            <wp:docPr id="18" name="Picture 6"/>
+            <wp:cNvGraphicFramePr>
+              <a:graphicFrameLocks xmlns:a="http://schemas.openxmlformats.org/drawingml/2006/main" noChangeAspect="1"/>
+            </wp:cNvGraphicFramePr>
+            <a:graphic xmlns:a="http://schemas.openxmlformats.org/drawingml/2006/main">
+              <a:graphicData uri="http://schemas.openxmlformats.org/drawingml/2006/picture">
+                <pic:pic xmlns:pic="http://schemas.openxmlformats.org/drawingml/2006/picture">
+                  <pic:nvPicPr>
+                    <pic:cNvPr id="18" name="Picture 6"/>
+                    <pic:cNvPicPr>
+                      <a:picLocks noChangeAspect="1"/>
+                    </pic:cNvPicPr>
+                  </pic:nvPicPr>
+                  <pic:blipFill>
+                    <a:blip r:embed="rId20"/>
+                    <a:stretch>
+                      <a:fillRect/>
+                    </a:stretch>
+                  </pic:blipFill>
+                  <pic:spPr>
+                    <a:xfrm>
+                      <a:off x="0" y="0"/>
+                      <a:ext cx="5274310" cy="2970530"/>
+                    </a:xfrm>
+                    <a:prstGeom prst="rect">
+                      <a:avLst/>
+                    </a:prstGeom>
+                    <a:noFill/>
+                    <a:ln>
+                      <a:noFill/>
+                    </a:ln>
+                  </pic:spPr>
+                </pic:pic>
+              </a:graphicData>
+            </a:graphic>
+          </wp:inline>
+        </w:drawing>
+      </w:r>
+      <w:bookmarkStart w:id="0" w:name="_GoBack"/>
+      <w:bookmarkEnd w:id="0"/>
+    </w:p>
+    <w:p>
+      <w:pPr>
+        <w:keepNext w:val="0"/>
+        <w:keepLines w:val="0"/>
+        <w:widowControl/>
+        <w:numPr>
+          <w:numId w:val="0"/>
+        </w:numPr>
+        <w:suppressLineNumbers w:val="0"/>
+        <w:tabs>
+          <w:tab w:val="left" w:pos="720"/>
+        </w:tabs>
+        <w:spacing w:before="0" w:beforeAutospacing="1" w:after="0" w:afterAutospacing="1"/>
+        <w:rPr>
+          <w:rFonts w:hint="default"/>
+          <w:lang w:val="en-IN"/>
+        </w:rPr>
+      </w:pPr>
+    </w:p>
+    <w:p>
+      <w:pPr>
+        <w:keepNext w:val="0"/>
+        <w:keepLines w:val="0"/>
+        <w:widowControl/>
+        <w:numPr>
+          <w:numId w:val="0"/>
+        </w:numPr>
+        <w:suppressLineNumbers w:val="0"/>
+        <w:tabs>
+          <w:tab w:val="left" w:pos="720"/>
+        </w:tabs>
+        <w:spacing w:before="0" w:beforeAutospacing="1" w:after="0" w:afterAutospacing="1"/>
+        <w:rPr>
+          <w:rFonts w:hint="default"/>
+          <w:lang w:val="en-IN"/>
+        </w:rPr>
+      </w:pPr>
+    </w:p>
+    <w:p>
+      <w:pPr>
+        <w:keepNext w:val="0"/>
+        <w:keepLines w:val="0"/>
+        <w:widowControl/>
+        <w:numPr>
+          <w:numId w:val="0"/>
+        </w:numPr>
+        <w:suppressLineNumbers w:val="0"/>
+        <w:tabs>
+          <w:tab w:val="left" w:pos="720"/>
+        </w:tabs>
+        <w:spacing w:before="0" w:beforeAutospacing="1" w:after="0" w:afterAutospacing="1"/>
+        <w:rPr>
+          <w:rFonts w:hint="default"/>
+          <w:lang w:val="en-IN"/>
+        </w:rPr>
+      </w:pPr>
+      <w:r>
+        <w:rPr>
+          <w:rFonts w:hint="default"/>
+          <w:lang w:val="en-IN"/>
+        </w:rPr>
+        <w:t xml:space="preserve">After successfully run with Jenkins pipeline </w:t>
+      </w:r>
+    </w:p>
+    <w:p>
+      <w:pPr>
+        <w:keepNext w:val="0"/>
+        <w:keepLines w:val="0"/>
+        <w:widowControl/>
+        <w:numPr>
+          <w:numId w:val="0"/>
+        </w:numPr>
+        <w:suppressLineNumbers w:val="0"/>
+        <w:tabs>
+          <w:tab w:val="left" w:pos="720"/>
+        </w:tabs>
+        <w:spacing w:before="0" w:beforeAutospacing="1" w:after="0" w:afterAutospacing="1"/>
+        <w:rPr>
+          <w:rFonts w:hint="default"/>
+          <w:lang w:val="en-IN"/>
+        </w:rPr>
+      </w:pPr>
+      <w:r>
+        <w:drawing>
+          <wp:inline distT="0" distB="0" distL="114300" distR="114300">
+            <wp:extent cx="5260975" cy="2976245"/>
+            <wp:effectExtent l="0" t="0" r="12065" b="10795"/>
+            <wp:docPr id="17" name="Picture 5"/>
+            <wp:cNvGraphicFramePr>
+              <a:graphicFrameLocks xmlns:a="http://schemas.openxmlformats.org/drawingml/2006/main" noChangeAspect="1"/>
+            </wp:cNvGraphicFramePr>
+            <a:graphic xmlns:a="http://schemas.openxmlformats.org/drawingml/2006/main">
+              <a:graphicData uri="http://schemas.openxmlformats.org/drawingml/2006/picture">
+                <pic:pic xmlns:pic="http://schemas.openxmlformats.org/drawingml/2006/picture">
+                  <pic:nvPicPr>
+                    <pic:cNvPr id="17" name="Picture 5"/>
+                    <pic:cNvPicPr>
+                      <a:picLocks noChangeAspect="1"/>
+                    </pic:cNvPicPr>
+                  </pic:nvPicPr>
+                  <pic:blipFill>
+                    <a:blip r:embed="rId21"/>
+                    <a:stretch>
+                      <a:fillRect/>
+                    </a:stretch>
+                  </pic:blipFill>
+                  <pic:spPr>
+                    <a:xfrm>
+                      <a:off x="0" y="0"/>
+                      <a:ext cx="5260975" cy="2976245"/>
+                    </a:xfrm>
+                    <a:prstGeom prst="rect">
+                      <a:avLst/>
+                    </a:prstGeom>
+                    <a:noFill/>
+                    <a:ln>
+                      <a:noFill/>
+                    </a:ln>
+                  </pic:spPr>
+                </pic:pic>
+              </a:graphicData>
+            </a:graphic>
+          </wp:inline>
+        </w:drawing>
       </w:r>
     </w:p>
     <w:p>

</xml_diff>